<commit_message>
added hand over report
</commit_message>
<xml_diff>
--- a/ppt-Catalog/handover report.docx
+++ b/ppt-Catalog/handover report.docx
@@ -1426,6 +1426,37 @@
     </w:p>
     <w:p>
       <w:r>
+        <w:rPr>
+          <w:noProof/>
+        </w:rPr>
+        <w:pict w14:anchorId="1263DB50">
+          <v:shapetype id="_x0000_t75" coordsize="21600,21600" o:spt="75" o:preferrelative="t" path="m@4@5l@4@11@9@11@9@5xe" filled="f" stroked="f">
+            <v:stroke joinstyle="miter"/>
+            <v:formulas>
+              <v:f eqn="if lineDrawn pixelLineWidth 0"/>
+              <v:f eqn="sum @0 1 0"/>
+              <v:f eqn="sum 0 0 @1"/>
+              <v:f eqn="prod @2 1 2"/>
+              <v:f eqn="prod @3 21600 pixelWidth"/>
+              <v:f eqn="prod @3 21600 pixelHeight"/>
+              <v:f eqn="sum @0 0 1"/>
+              <v:f eqn="prod @6 1 2"/>
+              <v:f eqn="prod @7 21600 pixelWidth"/>
+              <v:f eqn="sum @8 21600 0"/>
+              <v:f eqn="prod @7 21600 pixelHeight"/>
+              <v:f eqn="sum @10 21600 0"/>
+            </v:formulas>
+            <v:path o:extrusionok="f" gradientshapeok="t" o:connecttype="rect"/>
+            <o:lock v:ext="edit" aspectratio="t"/>
+          </v:shapetype>
+          <v:shape id="_x0000_i1220" type="#_x0000_t75" style="width:495pt;height:356.4pt;visibility:visible;mso-wrap-style:square">
+            <v:imagedata r:id="rId7" o:title=""/>
+          </v:shape>
+        </w:pict>
+      </w:r>
+    </w:p>
+    <w:p>
+      <w:r>
         <w:pict w14:anchorId="11FA846B">
           <v:rect id="_x0000_i1141" style="width:0;height:1.5pt" o:hralign="center" o:hrstd="t" o:hr="t" fillcolor="#a0a0a0" stroked="f"/>
         </w:pict>
@@ -1443,6 +1474,7 @@
           <w:b/>
           <w:bCs/>
         </w:rPr>
+        <w:lastRenderedPageBreak/>
         <w:t>7. Maintenance Guidelines</w:t>
       </w:r>
     </w:p>
@@ -1618,7 +1650,6 @@
           <w:b/>
           <w:bCs/>
         </w:rPr>
-        <w:lastRenderedPageBreak/>
         <w:t>🧾</w:t>
       </w:r>
       <w:r>
@@ -2048,6 +2079,7 @@
         <w:rPr>
           <w:rFonts w:ascii="Segoe UI Emoji" w:hAnsi="Segoe UI Emoji" w:cs="Segoe UI Emoji"/>
         </w:rPr>
+        <w:lastRenderedPageBreak/>
         <w:t>🌏</w:t>
       </w:r>
       <w:r>
@@ -2669,7 +2701,6 @@
           </w:tcPr>
           <w:p>
             <w:r>
-              <w:lastRenderedPageBreak/>
               <w:t>home-products.html</w:t>
             </w:r>
           </w:p>
@@ -3015,6 +3046,7 @@
         </w:numPr>
       </w:pPr>
       <w:r>
+        <w:lastRenderedPageBreak/>
         <w:t xml:space="preserve">/images/ — </w:t>
       </w:r>
       <w:proofErr w:type="spellStart"/>
@@ -3169,7 +3201,7 @@
       <w:r>
         <w:t xml:space="preserve"> </w:t>
       </w:r>
-      <w:hyperlink r:id="rId7" w:tgtFrame="_new" w:history="1">
+      <w:hyperlink r:id="rId8" w:tgtFrame="_new" w:history="1">
         <w:r>
           <w:rPr>
             <w:rStyle w:val="Hyperlink"/>
@@ -3213,7 +3245,7 @@
       <w:r>
         <w:t xml:space="preserve"> </w:t>
       </w:r>
-      <w:hyperlink r:id="rId8" w:tgtFrame="_new" w:history="1">
+      <w:hyperlink r:id="rId9" w:tgtFrame="_new" w:history="1">
         <w:r>
           <w:rPr>
             <w:rStyle w:val="Hyperlink"/>
@@ -3485,7 +3517,6 @@
               <w:rPr>
                 <w:rFonts w:ascii="MS Mincho" w:eastAsia="MS Mincho" w:hAnsi="MS Mincho" w:cs="MS Mincho" w:hint="eastAsia"/>
               </w:rPr>
-              <w:lastRenderedPageBreak/>
               <w:t>備用代碼</w:t>
             </w:r>
             <w:proofErr w:type="spellEnd"/>
@@ -3743,6 +3774,7 @@
         <w:rPr>
           <w:rFonts w:ascii="MS Mincho" w:eastAsia="MS Mincho" w:hAnsi="MS Mincho" w:cs="MS Mincho" w:hint="eastAsia"/>
         </w:rPr>
+        <w:lastRenderedPageBreak/>
         <w:t>此方式可正確測試</w:t>
       </w:r>
       <w:proofErr w:type="spellEnd"/>
@@ -4012,7 +4044,6 @@
         <w:rPr>
           <w:rFonts w:ascii="MS Mincho" w:eastAsia="MS Mincho" w:hAnsi="MS Mincho" w:cs="MS Mincho" w:hint="eastAsia"/>
         </w:rPr>
-        <w:lastRenderedPageBreak/>
         <w:t>建立一個「提交（</w:t>
       </w:r>
       <w:r>
@@ -4317,6 +4348,11 @@
       </w:r>
     </w:p>
     <w:p>
+      <w:pPr>
+        <w:rPr>
+          <w:rFonts w:ascii="Yu Gothic" w:eastAsia="Yu Gothic" w:hAnsi="Yu Gothic" w:cs="Yu Gothic"/>
+        </w:rPr>
+      </w:pPr>
       <w:r>
         <w:rPr>
           <w:rFonts w:ascii="MS Mincho" w:eastAsia="MS Mincho" w:hAnsi="MS Mincho" w:cs="MS Mincho" w:hint="eastAsia"/>
@@ -4362,6 +4398,19 @@
           <w:rFonts w:ascii="Yu Gothic" w:eastAsia="Yu Gothic" w:hAnsi="Yu Gothic" w:cs="Yu Gothic" w:hint="eastAsia"/>
         </w:rPr>
         <w:t>。</w:t>
+      </w:r>
+    </w:p>
+    <w:p>
+      <w:r>
+        <w:rPr>
+          <w:noProof/>
+        </w:rPr>
+        <w:lastRenderedPageBreak/>
+        <w:pict w14:anchorId="1F7FA3C4">
+          <v:shape id="Picture 1" o:spid="_x0000_i1214" type="#_x0000_t75" style="width:453pt;height:326.4pt;visibility:visible;mso-wrap-style:square">
+            <v:imagedata r:id="rId7" o:title=""/>
+          </v:shape>
+        </w:pict>
       </w:r>
     </w:p>
     <w:p>
@@ -4726,6 +4775,7 @@
           <w:b/>
           <w:bCs/>
         </w:rPr>
+        <w:lastRenderedPageBreak/>
         <w:t>8️</w:t>
       </w:r>
       <w:r>
@@ -4823,7 +4873,6 @@
         <w:rPr>
           <w:rFonts w:ascii="MS Mincho" w:eastAsia="MS Mincho" w:hAnsi="MS Mincho" w:cs="MS Mincho" w:hint="eastAsia"/>
         </w:rPr>
-        <w:lastRenderedPageBreak/>
         <w:t>所有程式碼與</w:t>
       </w:r>
       <w:r>
@@ -4916,7 +4965,7 @@
       <w:r>
         <w:t xml:space="preserve"> GitHub: </w:t>
       </w:r>
-      <w:hyperlink r:id="rId9" w:tgtFrame="_new" w:history="1">
+      <w:hyperlink r:id="rId10" w:tgtFrame="_new" w:history="1">
         <w:r>
           <w:rPr>
             <w:rStyle w:val="Hyperlink"/>

</xml_diff>